<commit_message>
Rebuild the English retelling as a copyable Word document
Convert the English .txt into a DOCX with the same paragraphs, so the
text file can be opened and copied in Word.

Co-authored-by: munlightshadow <munlightshadow@users.noreply.github.com>
</commit_message>
<xml_diff>
--- a/doc/ODNKNR_5_klass_retelling_en.docx
+++ b/doc/ODNKNR_5_klass_retelling_en.docx
@@ -2,11 +2,9 @@
 <file path=word/document.xml><?xml version="1.0" encoding="utf-8"?>
 <w:document xmlns:wpc="http://schemas.microsoft.com/office/word/2010/wordprocessingCanvas" xmlns:mo="http://schemas.microsoft.com/office/mac/office/2008/main" xmlns:mc="http://schemas.openxmlformats.org/markup-compatibility/2006" xmlns:mv="urn:schemas-microsoft-com:mac:vml" xmlns:o="urn:schemas-microsoft-com:office:office" xmlns:r="http://schemas.openxmlformats.org/officeDocument/2006/relationships" xmlns:m="http://schemas.openxmlformats.org/officeDocument/2006/math" xmlns:v="urn:schemas-microsoft-com:vml" xmlns:wp14="http://schemas.microsoft.com/office/word/2010/wordprocessingDrawing" xmlns:wp="http://schemas.openxmlformats.org/drawingml/2006/wordprocessingDrawing" xmlns:w10="urn:schemas-microsoft-com:office:word" xmlns:w="http://schemas.openxmlformats.org/wordprocessingml/2006/main" xmlns:w14="http://schemas.microsoft.com/office/word/2010/wordml" xmlns:wpg="http://schemas.microsoft.com/office/word/2010/wordprocessingGroup" xmlns:wpi="http://schemas.microsoft.com/office/word/2010/wordprocessingInk" xmlns:wne="http://schemas.microsoft.com/office/word/2006/wordml" xmlns:wps="http://schemas.microsoft.com/office/word/2010/wordprocessingShape" mc:Ignorable="w14 wp14">
   <w:body>
-    <w:p/>
-    <w:p/>
-    <w:p/>
     <w:p>
       <w:pPr>
+        <w:spacing w:before="120" w:after="120" w:line="276" w:lineRule="auto"/>
         <w:jc w:val="center"/>
       </w:pPr>
       <w:r>
@@ -15,15 +13,14 @@
           <w:b/>
           <w:i w:val="0"/>
           <w:color w:val="8B1A1A"/>
-          <w:sz w:val="52"/>
+          <w:sz w:val="44"/>
         </w:rPr>
         <w:t>Foundations of the Spiritual and Moral Culture</w:t>
-        <w:br/>
-        <w:t>of the Peoples of Russia</w:t>
       </w:r>
     </w:p>
     <w:p>
       <w:pPr>
+        <w:spacing w:before="120" w:after="120" w:line="276" w:lineRule="auto"/>
         <w:jc w:val="center"/>
       </w:pPr>
       <w:r>
@@ -31,14 +28,31 @@
           <w:rFonts w:ascii="Times New Roman" w:hAnsi="Times New Roman" w:eastAsia="Times New Roman" w:cs="Times New Roman"/>
           <w:b/>
           <w:i w:val="0"/>
-          <w:sz w:val="40"/>
+          <w:color w:val="8B1A1A"/>
+          <w:sz w:val="44"/>
+        </w:rPr>
+        <w:t>of the Peoples of Russia</w:t>
+      </w:r>
+    </w:p>
+    <w:p>
+      <w:pPr>
+        <w:spacing w:before="120" w:after="120" w:line="276" w:lineRule="auto"/>
+        <w:jc w:val="center"/>
+      </w:pPr>
+      <w:r>
+        <w:rPr>
+          <w:rFonts w:ascii="Times New Roman" w:hAnsi="Times New Roman" w:eastAsia="Times New Roman" w:cs="Times New Roman"/>
+          <w:b/>
+          <w:i w:val="0"/>
+          <w:color w:val="8B1A1A"/>
+          <w:sz w:val="36"/>
         </w:rPr>
         <w:t>Grade 5</w:t>
       </w:r>
     </w:p>
     <w:p>
       <w:pPr>
-        <w:spacing w:before="360"/>
+        <w:spacing w:before="240" w:after="240" w:line="276" w:lineRule="auto"/>
         <w:jc w:val="center"/>
       </w:pPr>
       <w:r>
@@ -53,7 +67,7 @@
     </w:p>
     <w:p>
       <w:pPr>
-        <w:spacing w:before="480"/>
+        <w:spacing w:before="0" w:after="80" w:line="276" w:lineRule="auto"/>
         <w:jc w:val="center"/>
       </w:pPr>
       <w:r>
@@ -64,15 +78,41 @@
           <w:sz w:val="24"/>
         </w:rPr>
         <w:t>Based on N. F. Vinogradova’s textbook</w:t>
-        <w:br/>
+      </w:r>
+    </w:p>
+    <w:p>
+      <w:pPr>
+        <w:spacing w:before="0" w:after="80" w:line="276" w:lineRule="auto"/>
+        <w:jc w:val="center"/>
+      </w:pPr>
+      <w:r>
+        <w:rPr>
+          <w:rFonts w:ascii="Times New Roman" w:hAnsi="Times New Roman" w:eastAsia="Times New Roman" w:cs="Times New Roman"/>
+          <w:b w:val="0"/>
+          <w:i w:val="0"/>
+          <w:sz w:val="24"/>
+        </w:rPr>
         <w:t>“Foundations of the Spiritual and Moral Culture of the Peoples of Russia.” Grade 5.</w:t>
-        <w:br/>
+      </w:r>
+    </w:p>
+    <w:p>
+      <w:pPr>
+        <w:spacing w:before="0" w:after="80" w:line="276" w:lineRule="auto"/>
+        <w:jc w:val="center"/>
+      </w:pPr>
+      <w:r>
+        <w:rPr>
+          <w:rFonts w:ascii="Times New Roman" w:hAnsi="Times New Roman" w:eastAsia="Times New Roman" w:cs="Times New Roman"/>
+          <w:b w:val="0"/>
+          <w:i w:val="0"/>
+          <w:sz w:val="24"/>
+        </w:rPr>
         <w:t>2nd stereotyped edition. Moscow: Prosveshcheniye, 2022.</w:t>
       </w:r>
     </w:p>
     <w:p>
       <w:pPr>
-        <w:spacing w:before="720"/>
+        <w:spacing w:before="240" w:after="360" w:line="276" w:lineRule="auto"/>
         <w:jc w:val="center"/>
       </w:pPr>
       <w:r>
@@ -80,21 +120,15 @@
           <w:rFonts w:ascii="Times New Roman" w:hAnsi="Times New Roman" w:eastAsia="Times New Roman" w:cs="Times New Roman"/>
           <w:b w:val="0"/>
           <w:i/>
-          <w:color w:val="444444"/>
+          <w:color w:val="555555"/>
           <w:sz w:val="24"/>
         </w:rPr>
         <w:t>This is not a copy of the textbook. It is an independent retelling of its ideas and stories, following the three parts of the scan in order (pages 1–30, 31–60, and 61–72).</w:t>
       </w:r>
     </w:p>
     <w:p>
-      <w:r>
-        <w:br w:type="page"/>
-      </w:r>
-    </w:p>
-    <w:p>
-      <w:pPr>
-        <w:keepNext/>
-        <w:spacing w:before="360" w:after="160"/>
+      <w:pPr>
+        <w:spacing w:before="360" w:after="160" w:line="276" w:lineRule="auto"/>
       </w:pPr>
       <w:r>
         <w:rPr>
@@ -109,7 +143,7 @@
     </w:p>
     <w:p>
       <w:pPr>
-        <w:spacing w:after="160" w:line="276" w:lineRule="auto"/>
+        <w:spacing w:before="0" w:after="160" w:line="276" w:lineRule="auto"/>
         <w:ind w:firstLine="709"/>
         <w:jc w:val="both"/>
       </w:pPr>
@@ -125,8 +159,7 @@
     </w:p>
     <w:p>
       <w:pPr>
-        <w:keepNext/>
-        <w:spacing w:before="360" w:after="160"/>
+        <w:spacing w:before="360" w:after="160" w:line="276" w:lineRule="auto"/>
       </w:pPr>
       <w:r>
         <w:rPr>
@@ -141,8 +174,7 @@
     </w:p>
     <w:p>
       <w:pPr>
-        <w:spacing w:after="40"/>
-        <w:ind w:left="0"/>
+        <w:spacing w:before="0" w:after="40" w:line="276" w:lineRule="auto"/>
       </w:pPr>
       <w:r>
         <w:rPr>
@@ -156,8 +188,7 @@
     </w:p>
     <w:p>
       <w:pPr>
-        <w:spacing w:after="40"/>
-        <w:ind w:left="567"/>
+        <w:spacing w:before="0" w:after="40" w:line="276" w:lineRule="auto"/>
       </w:pPr>
       <w:r>
         <w:rPr>
@@ -171,8 +202,7 @@
     </w:p>
     <w:p>
       <w:pPr>
-        <w:spacing w:after="40"/>
-        <w:ind w:left="567"/>
+        <w:spacing w:before="0" w:after="40" w:line="276" w:lineRule="auto"/>
       </w:pPr>
       <w:r>
         <w:rPr>
@@ -186,8 +216,7 @@
     </w:p>
     <w:p>
       <w:pPr>
-        <w:spacing w:after="40"/>
-        <w:ind w:left="567"/>
+        <w:spacing w:before="0" w:after="40" w:line="276" w:lineRule="auto"/>
       </w:pPr>
       <w:r>
         <w:rPr>
@@ -201,8 +230,7 @@
     </w:p>
     <w:p>
       <w:pPr>
-        <w:spacing w:after="40"/>
-        <w:ind w:left="567"/>
+        <w:spacing w:before="0" w:after="40" w:line="276" w:lineRule="auto"/>
       </w:pPr>
       <w:r>
         <w:rPr>
@@ -216,8 +244,7 @@
     </w:p>
     <w:p>
       <w:pPr>
-        <w:spacing w:after="40"/>
-        <w:ind w:left="567"/>
+        <w:spacing w:before="0" w:after="40" w:line="276" w:lineRule="auto"/>
       </w:pPr>
       <w:r>
         <w:rPr>
@@ -231,8 +258,7 @@
     </w:p>
     <w:p>
       <w:pPr>
-        <w:spacing w:after="40"/>
-        <w:ind w:left="567"/>
+        <w:spacing w:before="0" w:after="40" w:line="276" w:lineRule="auto"/>
       </w:pPr>
       <w:r>
         <w:rPr>
@@ -246,8 +272,7 @@
     </w:p>
     <w:p>
       <w:pPr>
-        <w:spacing w:after="40"/>
-        <w:ind w:left="567"/>
+        <w:spacing w:before="0" w:after="40" w:line="276" w:lineRule="auto"/>
       </w:pPr>
       <w:r>
         <w:rPr>
@@ -261,8 +286,7 @@
     </w:p>
     <w:p>
       <w:pPr>
-        <w:spacing w:after="40"/>
-        <w:ind w:left="0"/>
+        <w:spacing w:before="0" w:after="40" w:line="276" w:lineRule="auto"/>
       </w:pPr>
       <w:r>
         <w:rPr>
@@ -276,8 +300,7 @@
     </w:p>
     <w:p>
       <w:pPr>
-        <w:spacing w:after="40"/>
-        <w:ind w:left="567"/>
+        <w:spacing w:before="0" w:after="40" w:line="276" w:lineRule="auto"/>
       </w:pPr>
       <w:r>
         <w:rPr>
@@ -291,8 +314,7 @@
     </w:p>
     <w:p>
       <w:pPr>
-        <w:spacing w:after="40"/>
-        <w:ind w:left="567"/>
+        <w:spacing w:before="0" w:after="40" w:line="276" w:lineRule="auto"/>
       </w:pPr>
       <w:r>
         <w:rPr>
@@ -306,8 +328,7 @@
     </w:p>
     <w:p>
       <w:pPr>
-        <w:spacing w:after="40"/>
-        <w:ind w:left="567"/>
+        <w:spacing w:before="0" w:after="40" w:line="276" w:lineRule="auto"/>
       </w:pPr>
       <w:r>
         <w:rPr>
@@ -321,8 +342,7 @@
     </w:p>
     <w:p>
       <w:pPr>
-        <w:spacing w:after="40"/>
-        <w:ind w:left="567"/>
+        <w:spacing w:before="0" w:after="40" w:line="276" w:lineRule="auto"/>
       </w:pPr>
       <w:r>
         <w:rPr>
@@ -336,8 +356,7 @@
     </w:p>
     <w:p>
       <w:pPr>
-        <w:spacing w:after="40"/>
-        <w:ind w:left="567"/>
+        <w:spacing w:before="0" w:after="40" w:line="276" w:lineRule="auto"/>
       </w:pPr>
       <w:r>
         <w:rPr>
@@ -351,8 +370,7 @@
     </w:p>
     <w:p>
       <w:pPr>
-        <w:spacing w:after="40"/>
-        <w:ind w:left="0"/>
+        <w:spacing w:before="0" w:after="40" w:line="276" w:lineRule="auto"/>
       </w:pPr>
       <w:r>
         <w:rPr>
@@ -366,8 +384,7 @@
     </w:p>
     <w:p>
       <w:pPr>
-        <w:spacing w:after="40"/>
-        <w:ind w:left="567"/>
+        <w:spacing w:before="0" w:after="40" w:line="276" w:lineRule="auto"/>
       </w:pPr>
       <w:r>
         <w:rPr>
@@ -381,8 +398,7 @@
     </w:p>
     <w:p>
       <w:pPr>
-        <w:spacing w:after="40"/>
-        <w:ind w:left="567"/>
+        <w:spacing w:before="0" w:after="40" w:line="276" w:lineRule="auto"/>
       </w:pPr>
       <w:r>
         <w:rPr>
@@ -396,8 +412,7 @@
     </w:p>
     <w:p>
       <w:pPr>
-        <w:spacing w:after="40"/>
-        <w:ind w:left="567"/>
+        <w:spacing w:before="0" w:after="40" w:line="276" w:lineRule="auto"/>
       </w:pPr>
       <w:r>
         <w:rPr>
@@ -411,8 +426,7 @@
     </w:p>
     <w:p>
       <w:pPr>
-        <w:spacing w:after="40"/>
-        <w:ind w:left="567"/>
+        <w:spacing w:before="0" w:after="40" w:line="276" w:lineRule="auto"/>
       </w:pPr>
       <w:r>
         <w:rPr>
@@ -425,14 +439,8 @@
       </w:r>
     </w:p>
     <w:p>
-      <w:r>
-        <w:br w:type="page"/>
-      </w:r>
-    </w:p>
-    <w:p>
-      <w:pPr>
-        <w:keepNext/>
-        <w:spacing w:before="360" w:after="160"/>
+      <w:pPr>
+        <w:spacing w:before="360" w:after="160" w:line="276" w:lineRule="auto"/>
       </w:pPr>
       <w:r>
         <w:rPr>
@@ -447,7 +455,7 @@
     </w:p>
     <w:p>
       <w:pPr>
-        <w:spacing w:before="120" w:after="240"/>
+        <w:spacing w:before="80" w:after="240" w:line="276" w:lineRule="auto"/>
         <w:jc w:val="center"/>
       </w:pPr>
       <w:r>
@@ -463,8 +471,7 @@
     </w:p>
     <w:p>
       <w:pPr>
-        <w:keepNext/>
-        <w:spacing w:before="280" w:after="160"/>
+        <w:spacing w:before="280" w:after="160" w:line="276" w:lineRule="auto"/>
       </w:pPr>
       <w:r>
         <w:rPr>
@@ -479,7 +486,7 @@
     </w:p>
     <w:p>
       <w:pPr>
-        <w:spacing w:after="160" w:line="276" w:lineRule="auto"/>
+        <w:spacing w:before="0" w:after="160" w:line="276" w:lineRule="auto"/>
         <w:ind w:firstLine="709"/>
         <w:jc w:val="both"/>
       </w:pPr>
@@ -495,7 +502,7 @@
     </w:p>
     <w:p>
       <w:pPr>
-        <w:spacing w:after="160" w:line="276" w:lineRule="auto"/>
+        <w:spacing w:before="0" w:after="160" w:line="276" w:lineRule="auto"/>
         <w:ind w:firstLine="709"/>
         <w:jc w:val="both"/>
       </w:pPr>
@@ -511,7 +518,7 @@
     </w:p>
     <w:p>
       <w:pPr>
-        <w:spacing w:after="160" w:line="276" w:lineRule="auto"/>
+        <w:spacing w:before="0" w:after="160" w:line="276" w:lineRule="auto"/>
         <w:ind w:firstLine="709"/>
         <w:jc w:val="both"/>
       </w:pPr>
@@ -527,7 +534,7 @@
     </w:p>
     <w:p>
       <w:pPr>
-        <w:spacing w:after="160" w:line="276" w:lineRule="auto"/>
+        <w:spacing w:before="0" w:after="160" w:line="276" w:lineRule="auto"/>
         <w:ind w:firstLine="709"/>
         <w:jc w:val="both"/>
       </w:pPr>
@@ -543,7 +550,7 @@
     </w:p>
     <w:p>
       <w:pPr>
-        <w:spacing w:after="160" w:line="276" w:lineRule="auto"/>
+        <w:spacing w:before="0" w:after="160" w:line="276" w:lineRule="auto"/>
         <w:ind w:firstLine="709"/>
         <w:jc w:val="both"/>
       </w:pPr>
@@ -559,8 +566,7 @@
     </w:p>
     <w:p>
       <w:pPr>
-        <w:keepNext/>
-        <w:spacing w:before="280" w:after="160"/>
+        <w:spacing w:before="280" w:after="160" w:line="276" w:lineRule="auto"/>
       </w:pPr>
       <w:r>
         <w:rPr>
@@ -575,7 +581,7 @@
     </w:p>
     <w:p>
       <w:pPr>
-        <w:spacing w:after="160" w:line="276" w:lineRule="auto"/>
+        <w:spacing w:before="0" w:after="160" w:line="276" w:lineRule="auto"/>
         <w:ind w:firstLine="709"/>
         <w:jc w:val="both"/>
       </w:pPr>
@@ -591,7 +597,7 @@
     </w:p>
     <w:p>
       <w:pPr>
-        <w:spacing w:after="160" w:line="276" w:lineRule="auto"/>
+        <w:spacing w:before="0" w:after="160" w:line="276" w:lineRule="auto"/>
         <w:ind w:firstLine="709"/>
         <w:jc w:val="both"/>
       </w:pPr>
@@ -607,7 +613,7 @@
     </w:p>
     <w:p>
       <w:pPr>
-        <w:spacing w:after="160" w:line="276" w:lineRule="auto"/>
+        <w:spacing w:before="0" w:after="160" w:line="276" w:lineRule="auto"/>
         <w:ind w:firstLine="709"/>
         <w:jc w:val="both"/>
       </w:pPr>
@@ -623,7 +629,7 @@
     </w:p>
     <w:p>
       <w:pPr>
-        <w:spacing w:after="160" w:line="276" w:lineRule="auto"/>
+        <w:spacing w:before="0" w:after="160" w:line="276" w:lineRule="auto"/>
         <w:ind w:firstLine="709"/>
         <w:jc w:val="both"/>
       </w:pPr>
@@ -639,7 +645,7 @@
     </w:p>
     <w:p>
       <w:pPr>
-        <w:spacing w:after="160" w:line="276" w:lineRule="auto"/>
+        <w:spacing w:before="0" w:after="160" w:line="276" w:lineRule="auto"/>
         <w:ind w:firstLine="709"/>
         <w:jc w:val="both"/>
       </w:pPr>
@@ -655,8 +661,7 @@
     </w:p>
     <w:p>
       <w:pPr>
-        <w:keepNext/>
-        <w:spacing w:before="280" w:after="160"/>
+        <w:spacing w:before="280" w:after="160" w:line="276" w:lineRule="auto"/>
       </w:pPr>
       <w:r>
         <w:rPr>
@@ -671,7 +676,7 @@
     </w:p>
     <w:p>
       <w:pPr>
-        <w:spacing w:after="160" w:line="276" w:lineRule="auto"/>
+        <w:spacing w:before="0" w:after="160" w:line="276" w:lineRule="auto"/>
         <w:ind w:firstLine="709"/>
         <w:jc w:val="both"/>
       </w:pPr>
@@ -687,7 +692,7 @@
     </w:p>
     <w:p>
       <w:pPr>
-        <w:spacing w:after="160" w:line="276" w:lineRule="auto"/>
+        <w:spacing w:before="0" w:after="160" w:line="276" w:lineRule="auto"/>
         <w:ind w:firstLine="709"/>
         <w:jc w:val="both"/>
       </w:pPr>
@@ -703,7 +708,7 @@
     </w:p>
     <w:p>
       <w:pPr>
-        <w:spacing w:after="160" w:line="276" w:lineRule="auto"/>
+        <w:spacing w:before="0" w:after="160" w:line="276" w:lineRule="auto"/>
         <w:ind w:firstLine="709"/>
         <w:jc w:val="both"/>
       </w:pPr>
@@ -719,7 +724,7 @@
     </w:p>
     <w:p>
       <w:pPr>
-        <w:spacing w:after="160" w:line="276" w:lineRule="auto"/>
+        <w:spacing w:before="0" w:after="160" w:line="276" w:lineRule="auto"/>
         <w:ind w:firstLine="709"/>
         <w:jc w:val="both"/>
       </w:pPr>
@@ -735,8 +740,7 @@
     </w:p>
     <w:p>
       <w:pPr>
-        <w:keepNext/>
-        <w:spacing w:before="280" w:after="160"/>
+        <w:spacing w:before="280" w:after="160" w:line="276" w:lineRule="auto"/>
       </w:pPr>
       <w:r>
         <w:rPr>
@@ -751,7 +755,7 @@
     </w:p>
     <w:p>
       <w:pPr>
-        <w:spacing w:after="160" w:line="276" w:lineRule="auto"/>
+        <w:spacing w:before="0" w:after="160" w:line="276" w:lineRule="auto"/>
         <w:ind w:firstLine="709"/>
         <w:jc w:val="both"/>
       </w:pPr>
@@ -767,7 +771,7 @@
     </w:p>
     <w:p>
       <w:pPr>
-        <w:spacing w:after="160" w:line="276" w:lineRule="auto"/>
+        <w:spacing w:before="0" w:after="160" w:line="276" w:lineRule="auto"/>
         <w:ind w:firstLine="709"/>
         <w:jc w:val="both"/>
       </w:pPr>
@@ -783,7 +787,7 @@
     </w:p>
     <w:p>
       <w:pPr>
-        <w:spacing w:after="160" w:line="276" w:lineRule="auto"/>
+        <w:spacing w:before="0" w:after="160" w:line="276" w:lineRule="auto"/>
         <w:ind w:firstLine="709"/>
         <w:jc w:val="both"/>
       </w:pPr>
@@ -799,7 +803,7 @@
     </w:p>
     <w:p>
       <w:pPr>
-        <w:spacing w:after="160" w:line="276" w:lineRule="auto"/>
+        <w:spacing w:before="0" w:after="160" w:line="276" w:lineRule="auto"/>
         <w:ind w:firstLine="709"/>
         <w:jc w:val="both"/>
       </w:pPr>
@@ -815,7 +819,7 @@
     </w:p>
     <w:p>
       <w:pPr>
-        <w:spacing w:after="160" w:line="276" w:lineRule="auto"/>
+        <w:spacing w:before="0" w:after="160" w:line="276" w:lineRule="auto"/>
         <w:ind w:firstLine="709"/>
         <w:jc w:val="both"/>
       </w:pPr>
@@ -831,7 +835,7 @@
     </w:p>
     <w:p>
       <w:pPr>
-        <w:spacing w:after="160" w:line="276" w:lineRule="auto"/>
+        <w:spacing w:before="0" w:after="160" w:line="276" w:lineRule="auto"/>
         <w:ind w:firstLine="709"/>
         <w:jc w:val="both"/>
       </w:pPr>
@@ -847,7 +851,7 @@
     </w:p>
     <w:p>
       <w:pPr>
-        <w:spacing w:after="160" w:line="276" w:lineRule="auto"/>
+        <w:spacing w:before="0" w:after="160" w:line="276" w:lineRule="auto"/>
         <w:ind w:firstLine="709"/>
         <w:jc w:val="both"/>
       </w:pPr>
@@ -863,7 +867,7 @@
     </w:p>
     <w:p>
       <w:pPr>
-        <w:spacing w:after="160" w:line="276" w:lineRule="auto"/>
+        <w:spacing w:before="0" w:after="160" w:line="276" w:lineRule="auto"/>
         <w:ind w:firstLine="709"/>
         <w:jc w:val="both"/>
       </w:pPr>
@@ -879,7 +883,7 @@
     </w:p>
     <w:p>
       <w:pPr>
-        <w:spacing w:after="160" w:line="276" w:lineRule="auto"/>
+        <w:spacing w:before="0" w:after="160" w:line="276" w:lineRule="auto"/>
         <w:ind w:firstLine="709"/>
         <w:jc w:val="both"/>
       </w:pPr>
@@ -895,7 +899,7 @@
     </w:p>
     <w:p>
       <w:pPr>
-        <w:spacing w:after="160" w:line="276" w:lineRule="auto"/>
+        <w:spacing w:before="0" w:after="160" w:line="276" w:lineRule="auto"/>
         <w:ind w:firstLine="709"/>
         <w:jc w:val="both"/>
       </w:pPr>
@@ -911,7 +915,7 @@
     </w:p>
     <w:p>
       <w:pPr>
-        <w:spacing w:after="160" w:line="276" w:lineRule="auto"/>
+        <w:spacing w:before="0" w:after="160" w:line="276" w:lineRule="auto"/>
         <w:ind w:firstLine="709"/>
         <w:jc w:val="both"/>
       </w:pPr>
@@ -927,8 +931,7 @@
     </w:p>
     <w:p>
       <w:pPr>
-        <w:keepNext/>
-        <w:spacing w:before="280" w:after="160"/>
+        <w:spacing w:before="280" w:after="160" w:line="276" w:lineRule="auto"/>
       </w:pPr>
       <w:r>
         <w:rPr>
@@ -943,7 +946,7 @@
     </w:p>
     <w:p>
       <w:pPr>
-        <w:spacing w:after="160" w:line="276" w:lineRule="auto"/>
+        <w:spacing w:before="0" w:after="160" w:line="276" w:lineRule="auto"/>
         <w:ind w:firstLine="709"/>
         <w:jc w:val="both"/>
       </w:pPr>
@@ -959,7 +962,7 @@
     </w:p>
     <w:p>
       <w:pPr>
-        <w:spacing w:after="160" w:line="276" w:lineRule="auto"/>
+        <w:spacing w:before="0" w:after="160" w:line="276" w:lineRule="auto"/>
         <w:ind w:firstLine="709"/>
         <w:jc w:val="both"/>
       </w:pPr>
@@ -975,7 +978,7 @@
     </w:p>
     <w:p>
       <w:pPr>
-        <w:spacing w:after="160" w:line="276" w:lineRule="auto"/>
+        <w:spacing w:before="0" w:after="160" w:line="276" w:lineRule="auto"/>
         <w:ind w:firstLine="709"/>
         <w:jc w:val="both"/>
       </w:pPr>
@@ -991,7 +994,7 @@
     </w:p>
     <w:p>
       <w:pPr>
-        <w:spacing w:after="160" w:line="276" w:lineRule="auto"/>
+        <w:spacing w:before="0" w:after="160" w:line="276" w:lineRule="auto"/>
         <w:ind w:firstLine="709"/>
         <w:jc w:val="both"/>
       </w:pPr>
@@ -1007,7 +1010,7 @@
     </w:p>
     <w:p>
       <w:pPr>
-        <w:spacing w:after="160" w:line="276" w:lineRule="auto"/>
+        <w:spacing w:before="0" w:after="160" w:line="276" w:lineRule="auto"/>
         <w:ind w:firstLine="709"/>
         <w:jc w:val="both"/>
       </w:pPr>
@@ -1023,8 +1026,7 @@
     </w:p>
     <w:p>
       <w:pPr>
-        <w:keepNext/>
-        <w:spacing w:before="280" w:after="160"/>
+        <w:spacing w:before="280" w:after="160" w:line="276" w:lineRule="auto"/>
       </w:pPr>
       <w:r>
         <w:rPr>
@@ -1039,7 +1041,7 @@
     </w:p>
     <w:p>
       <w:pPr>
-        <w:spacing w:after="160" w:line="276" w:lineRule="auto"/>
+        <w:spacing w:before="0" w:after="160" w:line="276" w:lineRule="auto"/>
         <w:ind w:firstLine="709"/>
         <w:jc w:val="both"/>
       </w:pPr>
@@ -1055,7 +1057,7 @@
     </w:p>
     <w:p>
       <w:pPr>
-        <w:spacing w:after="160" w:line="276" w:lineRule="auto"/>
+        <w:spacing w:before="0" w:after="160" w:line="276" w:lineRule="auto"/>
         <w:ind w:firstLine="709"/>
         <w:jc w:val="both"/>
       </w:pPr>
@@ -1071,7 +1073,7 @@
     </w:p>
     <w:p>
       <w:pPr>
-        <w:spacing w:after="160" w:line="276" w:lineRule="auto"/>
+        <w:spacing w:before="0" w:after="160" w:line="276" w:lineRule="auto"/>
         <w:ind w:firstLine="709"/>
         <w:jc w:val="both"/>
       </w:pPr>
@@ -1087,7 +1089,7 @@
     </w:p>
     <w:p>
       <w:pPr>
-        <w:spacing w:after="160" w:line="276" w:lineRule="auto"/>
+        <w:spacing w:before="0" w:after="160" w:line="276" w:lineRule="auto"/>
         <w:ind w:firstLine="709"/>
         <w:jc w:val="both"/>
       </w:pPr>
@@ -1103,8 +1105,7 @@
     </w:p>
     <w:p>
       <w:pPr>
-        <w:keepNext/>
-        <w:spacing w:before="280" w:after="160"/>
+        <w:spacing w:before="280" w:after="160" w:line="276" w:lineRule="auto"/>
       </w:pPr>
       <w:r>
         <w:rPr>
@@ -1119,7 +1120,7 @@
     </w:p>
     <w:p>
       <w:pPr>
-        <w:spacing w:after="160" w:line="276" w:lineRule="auto"/>
+        <w:spacing w:before="0" w:after="160" w:line="276" w:lineRule="auto"/>
         <w:ind w:firstLine="709"/>
         <w:jc w:val="both"/>
       </w:pPr>
@@ -1135,7 +1136,7 @@
     </w:p>
     <w:p>
       <w:pPr>
-        <w:spacing w:after="160" w:line="276" w:lineRule="auto"/>
+        <w:spacing w:before="0" w:after="160" w:line="276" w:lineRule="auto"/>
         <w:ind w:firstLine="709"/>
         <w:jc w:val="both"/>
       </w:pPr>
@@ -1151,7 +1152,7 @@
     </w:p>
     <w:p>
       <w:pPr>
-        <w:spacing w:after="160" w:line="276" w:lineRule="auto"/>
+        <w:spacing w:before="0" w:after="160" w:line="276" w:lineRule="auto"/>
         <w:ind w:firstLine="709"/>
         <w:jc w:val="both"/>
       </w:pPr>
@@ -1167,7 +1168,7 @@
     </w:p>
     <w:p>
       <w:pPr>
-        <w:spacing w:after="160" w:line="276" w:lineRule="auto"/>
+        <w:spacing w:before="0" w:after="160" w:line="276" w:lineRule="auto"/>
         <w:ind w:firstLine="709"/>
         <w:jc w:val="both"/>
       </w:pPr>
@@ -1182,14 +1183,8 @@
       </w:r>
     </w:p>
     <w:p>
-      <w:r>
-        <w:br w:type="page"/>
-      </w:r>
-    </w:p>
-    <w:p>
-      <w:pPr>
-        <w:keepNext/>
-        <w:spacing w:before="360" w:after="160"/>
+      <w:pPr>
+        <w:spacing w:before="360" w:after="160" w:line="276" w:lineRule="auto"/>
       </w:pPr>
       <w:r>
         <w:rPr>
@@ -1204,7 +1199,7 @@
     </w:p>
     <w:p>
       <w:pPr>
-        <w:spacing w:before="120" w:after="240"/>
+        <w:spacing w:before="80" w:after="240" w:line="276" w:lineRule="auto"/>
         <w:jc w:val="center"/>
       </w:pPr>
       <w:r>
@@ -1220,8 +1215,7 @@
     </w:p>
     <w:p>
       <w:pPr>
-        <w:keepNext/>
-        <w:spacing w:before="280" w:after="160"/>
+        <w:spacing w:before="280" w:after="160" w:line="276" w:lineRule="auto"/>
       </w:pPr>
       <w:r>
         <w:rPr>
@@ -1236,7 +1230,7 @@
     </w:p>
     <w:p>
       <w:pPr>
-        <w:spacing w:after="160" w:line="276" w:lineRule="auto"/>
+        <w:spacing w:before="0" w:after="160" w:line="276" w:lineRule="auto"/>
         <w:ind w:firstLine="709"/>
         <w:jc w:val="both"/>
       </w:pPr>
@@ -1252,7 +1246,7 @@
     </w:p>
     <w:p>
       <w:pPr>
-        <w:spacing w:after="160" w:line="276" w:lineRule="auto"/>
+        <w:spacing w:before="0" w:after="160" w:line="276" w:lineRule="auto"/>
         <w:ind w:firstLine="709"/>
         <w:jc w:val="both"/>
       </w:pPr>
@@ -1268,7 +1262,7 @@
     </w:p>
     <w:p>
       <w:pPr>
-        <w:spacing w:after="160" w:line="276" w:lineRule="auto"/>
+        <w:spacing w:before="0" w:after="160" w:line="276" w:lineRule="auto"/>
         <w:ind w:firstLine="709"/>
         <w:jc w:val="both"/>
       </w:pPr>
@@ -1284,7 +1278,7 @@
     </w:p>
     <w:p>
       <w:pPr>
-        <w:spacing w:after="160" w:line="276" w:lineRule="auto"/>
+        <w:spacing w:before="0" w:after="160" w:line="276" w:lineRule="auto"/>
         <w:ind w:firstLine="709"/>
         <w:jc w:val="both"/>
       </w:pPr>
@@ -1300,7 +1294,7 @@
     </w:p>
     <w:p>
       <w:pPr>
-        <w:spacing w:after="160" w:line="276" w:lineRule="auto"/>
+        <w:spacing w:before="0" w:after="160" w:line="276" w:lineRule="auto"/>
         <w:ind w:firstLine="709"/>
         <w:jc w:val="both"/>
       </w:pPr>
@@ -1316,7 +1310,7 @@
     </w:p>
     <w:p>
       <w:pPr>
-        <w:spacing w:after="160" w:line="276" w:lineRule="auto"/>
+        <w:spacing w:before="0" w:after="160" w:line="276" w:lineRule="auto"/>
         <w:ind w:firstLine="709"/>
         <w:jc w:val="both"/>
       </w:pPr>
@@ -1332,7 +1326,7 @@
     </w:p>
     <w:p>
       <w:pPr>
-        <w:spacing w:after="160" w:line="276" w:lineRule="auto"/>
+        <w:spacing w:before="0" w:after="160" w:line="276" w:lineRule="auto"/>
         <w:ind w:firstLine="709"/>
         <w:jc w:val="both"/>
       </w:pPr>
@@ -1348,8 +1342,7 @@
     </w:p>
     <w:p>
       <w:pPr>
-        <w:keepNext/>
-        <w:spacing w:before="280" w:after="160"/>
+        <w:spacing w:before="280" w:after="160" w:line="276" w:lineRule="auto"/>
       </w:pPr>
       <w:r>
         <w:rPr>
@@ -1364,7 +1357,7 @@
     </w:p>
     <w:p>
       <w:pPr>
-        <w:spacing w:after="160" w:line="276" w:lineRule="auto"/>
+        <w:spacing w:before="0" w:after="160" w:line="276" w:lineRule="auto"/>
         <w:ind w:firstLine="709"/>
         <w:jc w:val="both"/>
       </w:pPr>
@@ -1380,7 +1373,7 @@
     </w:p>
     <w:p>
       <w:pPr>
-        <w:spacing w:after="160" w:line="276" w:lineRule="auto"/>
+        <w:spacing w:before="0" w:after="160" w:line="276" w:lineRule="auto"/>
         <w:ind w:firstLine="709"/>
         <w:jc w:val="both"/>
       </w:pPr>
@@ -1396,7 +1389,7 @@
     </w:p>
     <w:p>
       <w:pPr>
-        <w:spacing w:after="160" w:line="276" w:lineRule="auto"/>
+        <w:spacing w:before="0" w:after="160" w:line="276" w:lineRule="auto"/>
         <w:ind w:firstLine="709"/>
         <w:jc w:val="both"/>
       </w:pPr>
@@ -1412,7 +1405,7 @@
     </w:p>
     <w:p>
       <w:pPr>
-        <w:spacing w:after="160" w:line="276" w:lineRule="auto"/>
+        <w:spacing w:before="0" w:after="160" w:line="276" w:lineRule="auto"/>
         <w:ind w:firstLine="709"/>
         <w:jc w:val="both"/>
       </w:pPr>
@@ -1428,8 +1421,7 @@
     </w:p>
     <w:p>
       <w:pPr>
-        <w:keepNext/>
-        <w:spacing w:before="280" w:after="160"/>
+        <w:spacing w:before="280" w:after="160" w:line="276" w:lineRule="auto"/>
       </w:pPr>
       <w:r>
         <w:rPr>
@@ -1444,7 +1436,7 @@
     </w:p>
     <w:p>
       <w:pPr>
-        <w:spacing w:after="160" w:line="276" w:lineRule="auto"/>
+        <w:spacing w:before="0" w:after="160" w:line="276" w:lineRule="auto"/>
         <w:ind w:firstLine="709"/>
         <w:jc w:val="both"/>
       </w:pPr>
@@ -1460,7 +1452,7 @@
     </w:p>
     <w:p>
       <w:pPr>
-        <w:spacing w:after="160" w:line="276" w:lineRule="auto"/>
+        <w:spacing w:before="0" w:after="160" w:line="276" w:lineRule="auto"/>
         <w:ind w:firstLine="709"/>
         <w:jc w:val="both"/>
       </w:pPr>
@@ -1476,7 +1468,7 @@
     </w:p>
     <w:p>
       <w:pPr>
-        <w:spacing w:after="160" w:line="276" w:lineRule="auto"/>
+        <w:spacing w:before="0" w:after="160" w:line="276" w:lineRule="auto"/>
         <w:ind w:firstLine="709"/>
         <w:jc w:val="both"/>
       </w:pPr>
@@ -1492,7 +1484,7 @@
     </w:p>
     <w:p>
       <w:pPr>
-        <w:spacing w:after="160" w:line="276" w:lineRule="auto"/>
+        <w:spacing w:before="0" w:after="160" w:line="276" w:lineRule="auto"/>
         <w:ind w:firstLine="709"/>
         <w:jc w:val="both"/>
       </w:pPr>
@@ -1508,7 +1500,7 @@
     </w:p>
     <w:p>
       <w:pPr>
-        <w:spacing w:after="160" w:line="276" w:lineRule="auto"/>
+        <w:spacing w:before="0" w:after="160" w:line="276" w:lineRule="auto"/>
         <w:ind w:firstLine="709"/>
         <w:jc w:val="both"/>
       </w:pPr>
@@ -1524,7 +1516,7 @@
     </w:p>
     <w:p>
       <w:pPr>
-        <w:spacing w:after="160" w:line="276" w:lineRule="auto"/>
+        <w:spacing w:before="0" w:after="160" w:line="276" w:lineRule="auto"/>
         <w:ind w:firstLine="709"/>
         <w:jc w:val="both"/>
       </w:pPr>
@@ -1540,8 +1532,7 @@
     </w:p>
     <w:p>
       <w:pPr>
-        <w:keepNext/>
-        <w:spacing w:before="280" w:after="160"/>
+        <w:spacing w:before="280" w:after="160" w:line="276" w:lineRule="auto"/>
       </w:pPr>
       <w:r>
         <w:rPr>
@@ -1556,7 +1547,7 @@
     </w:p>
     <w:p>
       <w:pPr>
-        <w:spacing w:after="160" w:line="276" w:lineRule="auto"/>
+        <w:spacing w:before="0" w:after="160" w:line="276" w:lineRule="auto"/>
         <w:ind w:firstLine="709"/>
         <w:jc w:val="both"/>
       </w:pPr>
@@ -1572,7 +1563,7 @@
     </w:p>
     <w:p>
       <w:pPr>
-        <w:spacing w:after="160" w:line="276" w:lineRule="auto"/>
+        <w:spacing w:before="0" w:after="160" w:line="276" w:lineRule="auto"/>
         <w:ind w:firstLine="709"/>
         <w:jc w:val="both"/>
       </w:pPr>
@@ -1588,7 +1579,7 @@
     </w:p>
     <w:p>
       <w:pPr>
-        <w:spacing w:after="160" w:line="276" w:lineRule="auto"/>
+        <w:spacing w:before="0" w:after="160" w:line="276" w:lineRule="auto"/>
         <w:ind w:firstLine="709"/>
         <w:jc w:val="both"/>
       </w:pPr>
@@ -1604,7 +1595,7 @@
     </w:p>
     <w:p>
       <w:pPr>
-        <w:spacing w:after="160" w:line="276" w:lineRule="auto"/>
+        <w:spacing w:before="0" w:after="160" w:line="276" w:lineRule="auto"/>
         <w:ind w:firstLine="709"/>
         <w:jc w:val="both"/>
       </w:pPr>
@@ -1620,7 +1611,7 @@
     </w:p>
     <w:p>
       <w:pPr>
-        <w:spacing w:after="160" w:line="276" w:lineRule="auto"/>
+        <w:spacing w:before="0" w:after="160" w:line="276" w:lineRule="auto"/>
         <w:ind w:firstLine="709"/>
         <w:jc w:val="both"/>
       </w:pPr>
@@ -1636,8 +1627,7 @@
     </w:p>
     <w:p>
       <w:pPr>
-        <w:keepNext/>
-        <w:spacing w:before="280" w:after="160"/>
+        <w:spacing w:before="280" w:after="160" w:line="276" w:lineRule="auto"/>
       </w:pPr>
       <w:r>
         <w:rPr>
@@ -1652,7 +1642,7 @@
     </w:p>
     <w:p>
       <w:pPr>
-        <w:spacing w:after="160" w:line="276" w:lineRule="auto"/>
+        <w:spacing w:before="0" w:after="160" w:line="276" w:lineRule="auto"/>
         <w:ind w:firstLine="709"/>
         <w:jc w:val="both"/>
       </w:pPr>
@@ -1668,7 +1658,7 @@
     </w:p>
     <w:p>
       <w:pPr>
-        <w:spacing w:after="160" w:line="276" w:lineRule="auto"/>
+        <w:spacing w:before="0" w:after="160" w:line="276" w:lineRule="auto"/>
         <w:ind w:firstLine="709"/>
         <w:jc w:val="both"/>
       </w:pPr>
@@ -1684,7 +1674,7 @@
     </w:p>
     <w:p>
       <w:pPr>
-        <w:spacing w:after="160" w:line="276" w:lineRule="auto"/>
+        <w:spacing w:before="0" w:after="160" w:line="276" w:lineRule="auto"/>
         <w:ind w:firstLine="709"/>
         <w:jc w:val="both"/>
       </w:pPr>
@@ -1700,7 +1690,7 @@
     </w:p>
     <w:p>
       <w:pPr>
-        <w:spacing w:after="160" w:line="276" w:lineRule="auto"/>
+        <w:spacing w:before="0" w:after="160" w:line="276" w:lineRule="auto"/>
         <w:ind w:firstLine="709"/>
         <w:jc w:val="both"/>
       </w:pPr>
@@ -1716,7 +1706,7 @@
     </w:p>
     <w:p>
       <w:pPr>
-        <w:spacing w:after="160" w:line="276" w:lineRule="auto"/>
+        <w:spacing w:before="0" w:after="160" w:line="276" w:lineRule="auto"/>
         <w:ind w:firstLine="709"/>
         <w:jc w:val="both"/>
       </w:pPr>
@@ -1732,7 +1722,7 @@
     </w:p>
     <w:p>
       <w:pPr>
-        <w:spacing w:after="160" w:line="276" w:lineRule="auto"/>
+        <w:spacing w:before="0" w:after="160" w:line="276" w:lineRule="auto"/>
         <w:ind w:firstLine="709"/>
         <w:jc w:val="both"/>
       </w:pPr>
@@ -1747,14 +1737,8 @@
       </w:r>
     </w:p>
     <w:p>
-      <w:r>
-        <w:br w:type="page"/>
-      </w:r>
-    </w:p>
-    <w:p>
-      <w:pPr>
-        <w:keepNext/>
-        <w:spacing w:before="360" w:after="160"/>
+      <w:pPr>
+        <w:spacing w:before="360" w:after="160" w:line="276" w:lineRule="auto"/>
       </w:pPr>
       <w:r>
         <w:rPr>
@@ -1769,7 +1753,7 @@
     </w:p>
     <w:p>
       <w:pPr>
-        <w:spacing w:before="120" w:after="240"/>
+        <w:spacing w:before="80" w:after="240" w:line="276" w:lineRule="auto"/>
         <w:jc w:val="center"/>
       </w:pPr>
       <w:r>
@@ -1785,8 +1769,7 @@
     </w:p>
     <w:p>
       <w:pPr>
-        <w:keepNext/>
-        <w:spacing w:before="280" w:after="160"/>
+        <w:spacing w:before="280" w:after="160" w:line="276" w:lineRule="auto"/>
       </w:pPr>
       <w:r>
         <w:rPr>
@@ -1801,7 +1784,7 @@
     </w:p>
     <w:p>
       <w:pPr>
-        <w:spacing w:after="160" w:line="276" w:lineRule="auto"/>
+        <w:spacing w:before="0" w:after="160" w:line="276" w:lineRule="auto"/>
         <w:ind w:firstLine="709"/>
         <w:jc w:val="both"/>
       </w:pPr>
@@ -1817,7 +1800,7 @@
     </w:p>
     <w:p>
       <w:pPr>
-        <w:spacing w:after="160" w:line="276" w:lineRule="auto"/>
+        <w:spacing w:before="0" w:after="160" w:line="276" w:lineRule="auto"/>
         <w:ind w:firstLine="709"/>
         <w:jc w:val="both"/>
       </w:pPr>
@@ -1833,7 +1816,7 @@
     </w:p>
     <w:p>
       <w:pPr>
-        <w:spacing w:after="160" w:line="276" w:lineRule="auto"/>
+        <w:spacing w:before="0" w:after="160" w:line="276" w:lineRule="auto"/>
         <w:ind w:firstLine="709"/>
         <w:jc w:val="both"/>
       </w:pPr>
@@ -1849,8 +1832,7 @@
     </w:p>
     <w:p>
       <w:pPr>
-        <w:keepNext/>
-        <w:spacing w:before="280" w:after="160"/>
+        <w:spacing w:before="280" w:after="160" w:line="276" w:lineRule="auto"/>
       </w:pPr>
       <w:r>
         <w:rPr>
@@ -1865,7 +1847,7 @@
     </w:p>
     <w:p>
       <w:pPr>
-        <w:spacing w:after="160" w:line="276" w:lineRule="auto"/>
+        <w:spacing w:before="0" w:after="160" w:line="276" w:lineRule="auto"/>
         <w:ind w:firstLine="709"/>
         <w:jc w:val="both"/>
       </w:pPr>
@@ -1881,7 +1863,7 @@
     </w:p>
     <w:p>
       <w:pPr>
-        <w:spacing w:after="160" w:line="276" w:lineRule="auto"/>
+        <w:spacing w:before="0" w:after="160" w:line="276" w:lineRule="auto"/>
         <w:ind w:firstLine="709"/>
         <w:jc w:val="both"/>
       </w:pPr>
@@ -1897,7 +1879,7 @@
     </w:p>
     <w:p>
       <w:pPr>
-        <w:spacing w:after="160" w:line="276" w:lineRule="auto"/>
+        <w:spacing w:before="0" w:after="160" w:line="276" w:lineRule="auto"/>
         <w:ind w:firstLine="709"/>
         <w:jc w:val="both"/>
       </w:pPr>
@@ -1913,8 +1895,7 @@
     </w:p>
     <w:p>
       <w:pPr>
-        <w:keepNext/>
-        <w:spacing w:before="280" w:after="160"/>
+        <w:spacing w:before="280" w:after="160" w:line="276" w:lineRule="auto"/>
       </w:pPr>
       <w:r>
         <w:rPr>
@@ -1929,7 +1910,7 @@
     </w:p>
     <w:p>
       <w:pPr>
-        <w:spacing w:after="160" w:line="276" w:lineRule="auto"/>
+        <w:spacing w:before="0" w:after="160" w:line="276" w:lineRule="auto"/>
         <w:ind w:firstLine="709"/>
         <w:jc w:val="both"/>
       </w:pPr>
@@ -1945,7 +1926,7 @@
     </w:p>
     <w:p>
       <w:pPr>
-        <w:spacing w:after="160" w:line="276" w:lineRule="auto"/>
+        <w:spacing w:before="0" w:after="160" w:line="276" w:lineRule="auto"/>
         <w:ind w:firstLine="709"/>
         <w:jc w:val="both"/>
       </w:pPr>
@@ -1961,7 +1942,7 @@
     </w:p>
     <w:p>
       <w:pPr>
-        <w:spacing w:after="160" w:line="276" w:lineRule="auto"/>
+        <w:spacing w:before="0" w:after="160" w:line="276" w:lineRule="auto"/>
         <w:ind w:firstLine="709"/>
         <w:jc w:val="both"/>
       </w:pPr>
@@ -1977,7 +1958,7 @@
     </w:p>
     <w:p>
       <w:pPr>
-        <w:spacing w:after="160" w:line="276" w:lineRule="auto"/>
+        <w:spacing w:before="0" w:after="160" w:line="276" w:lineRule="auto"/>
         <w:ind w:firstLine="709"/>
         <w:jc w:val="both"/>
       </w:pPr>
@@ -1993,8 +1974,7 @@
     </w:p>
     <w:p>
       <w:pPr>
-        <w:keepNext/>
-        <w:spacing w:before="280" w:after="160"/>
+        <w:spacing w:before="280" w:after="160" w:line="276" w:lineRule="auto"/>
       </w:pPr>
       <w:r>
         <w:rPr>
@@ -2009,7 +1989,7 @@
     </w:p>
     <w:p>
       <w:pPr>
-        <w:spacing w:after="160" w:line="276" w:lineRule="auto"/>
+        <w:spacing w:before="0" w:after="160" w:line="276" w:lineRule="auto"/>
         <w:ind w:firstLine="709"/>
         <w:jc w:val="both"/>
       </w:pPr>
@@ -2025,7 +2005,7 @@
     </w:p>
     <w:p>
       <w:pPr>
-        <w:spacing w:after="160" w:line="276" w:lineRule="auto"/>
+        <w:spacing w:before="0" w:after="160" w:line="276" w:lineRule="auto"/>
         <w:ind w:firstLine="709"/>
         <w:jc w:val="both"/>
       </w:pPr>
@@ -2041,8 +2021,7 @@
     </w:p>
     <w:p>
       <w:pPr>
-        <w:keepNext/>
-        <w:spacing w:before="280" w:after="160"/>
+        <w:spacing w:before="280" w:after="160" w:line="276" w:lineRule="auto"/>
       </w:pPr>
       <w:r>
         <w:rPr>
@@ -2057,7 +2036,7 @@
     </w:p>
     <w:p>
       <w:pPr>
-        <w:spacing w:after="160" w:line="276" w:lineRule="auto"/>
+        <w:spacing w:before="0" w:after="160" w:line="276" w:lineRule="auto"/>
         <w:ind w:firstLine="709"/>
         <w:jc w:val="both"/>
       </w:pPr>
@@ -2073,8 +2052,9 @@
     </w:p>
     <w:p>
       <w:pPr>
-        <w:pStyle w:val="ListBullet"/>
-        <w:spacing w:after="80" w:line="276" w:lineRule="auto"/>
+        <w:spacing w:before="0" w:after="160" w:line="276" w:lineRule="auto"/>
+        <w:ind w:firstLine="709"/>
+        <w:jc w:val="both"/>
       </w:pPr>
       <w:r>
         <w:rPr>
@@ -2088,8 +2068,9 @@
     </w:p>
     <w:p>
       <w:pPr>
-        <w:pStyle w:val="ListBullet"/>
-        <w:spacing w:after="80" w:line="276" w:lineRule="auto"/>
+        <w:spacing w:before="0" w:after="160" w:line="276" w:lineRule="auto"/>
+        <w:ind w:firstLine="709"/>
+        <w:jc w:val="both"/>
       </w:pPr>
       <w:r>
         <w:rPr>
@@ -2103,8 +2084,9 @@
     </w:p>
     <w:p>
       <w:pPr>
-        <w:pStyle w:val="ListBullet"/>
-        <w:spacing w:after="80" w:line="276" w:lineRule="auto"/>
+        <w:spacing w:before="0" w:after="160" w:line="276" w:lineRule="auto"/>
+        <w:ind w:firstLine="709"/>
+        <w:jc w:val="both"/>
       </w:pPr>
       <w:r>
         <w:rPr>
@@ -2118,8 +2100,9 @@
     </w:p>
     <w:p>
       <w:pPr>
-        <w:pStyle w:val="ListBullet"/>
-        <w:spacing w:after="80" w:line="276" w:lineRule="auto"/>
+        <w:spacing w:before="0" w:after="160" w:line="276" w:lineRule="auto"/>
+        <w:ind w:firstLine="709"/>
+        <w:jc w:val="both"/>
       </w:pPr>
       <w:r>
         <w:rPr>
@@ -2133,8 +2116,9 @@
     </w:p>
     <w:p>
       <w:pPr>
-        <w:pStyle w:val="ListBullet"/>
-        <w:spacing w:after="80" w:line="276" w:lineRule="auto"/>
+        <w:spacing w:before="0" w:after="160" w:line="276" w:lineRule="auto"/>
+        <w:ind w:firstLine="709"/>
+        <w:jc w:val="both"/>
       </w:pPr>
       <w:r>
         <w:rPr>
@@ -2148,8 +2132,9 @@
     </w:p>
     <w:p>
       <w:pPr>
-        <w:pStyle w:val="ListBullet"/>
-        <w:spacing w:after="80" w:line="276" w:lineRule="auto"/>
+        <w:spacing w:before="0" w:after="160" w:line="276" w:lineRule="auto"/>
+        <w:ind w:firstLine="709"/>
+        <w:jc w:val="both"/>
       </w:pPr>
       <w:r>
         <w:rPr>
@@ -2163,8 +2148,9 @@
     </w:p>
     <w:p>
       <w:pPr>
-        <w:pStyle w:val="ListBullet"/>
-        <w:spacing w:after="80" w:line="276" w:lineRule="auto"/>
+        <w:spacing w:before="0" w:after="160" w:line="276" w:lineRule="auto"/>
+        <w:ind w:firstLine="709"/>
+        <w:jc w:val="both"/>
       </w:pPr>
       <w:r>
         <w:rPr>
@@ -2178,8 +2164,9 @@
     </w:p>
     <w:p>
       <w:pPr>
-        <w:pStyle w:val="ListBullet"/>
-        <w:spacing w:after="80" w:line="276" w:lineRule="auto"/>
+        <w:spacing w:before="0" w:after="160" w:line="276" w:lineRule="auto"/>
+        <w:ind w:firstLine="709"/>
+        <w:jc w:val="both"/>
       </w:pPr>
       <w:r>
         <w:rPr>
@@ -2193,8 +2180,9 @@
     </w:p>
     <w:p>
       <w:pPr>
-        <w:pStyle w:val="ListBullet"/>
-        <w:spacing w:after="80" w:line="276" w:lineRule="auto"/>
+        <w:spacing w:before="0" w:after="160" w:line="276" w:lineRule="auto"/>
+        <w:ind w:firstLine="709"/>
+        <w:jc w:val="both"/>
       </w:pPr>
       <w:r>
         <w:rPr>
@@ -2208,8 +2196,9 @@
     </w:p>
     <w:p>
       <w:pPr>
-        <w:pStyle w:val="ListBullet"/>
-        <w:spacing w:after="80" w:line="276" w:lineRule="auto"/>
+        <w:spacing w:before="0" w:after="160" w:line="276" w:lineRule="auto"/>
+        <w:ind w:firstLine="709"/>
+        <w:jc w:val="both"/>
       </w:pPr>
       <w:r>
         <w:rPr>
@@ -2223,8 +2212,9 @@
     </w:p>
     <w:p>
       <w:pPr>
-        <w:pStyle w:val="ListBullet"/>
-        <w:spacing w:after="80" w:line="276" w:lineRule="auto"/>
+        <w:spacing w:before="0" w:after="160" w:line="276" w:lineRule="auto"/>
+        <w:ind w:firstLine="709"/>
+        <w:jc w:val="both"/>
       </w:pPr>
       <w:r>
         <w:rPr>
@@ -2238,8 +2228,9 @@
     </w:p>
     <w:p>
       <w:pPr>
-        <w:pStyle w:val="ListBullet"/>
-        <w:spacing w:after="80" w:line="276" w:lineRule="auto"/>
+        <w:spacing w:before="0" w:after="160" w:line="276" w:lineRule="auto"/>
+        <w:ind w:firstLine="709"/>
+        <w:jc w:val="both"/>
       </w:pPr>
       <w:r>
         <w:rPr>
@@ -2253,8 +2244,9 @@
     </w:p>
     <w:p>
       <w:pPr>
-        <w:pStyle w:val="ListBullet"/>
-        <w:spacing w:after="80" w:line="276" w:lineRule="auto"/>
+        <w:spacing w:before="0" w:after="160" w:line="276" w:lineRule="auto"/>
+        <w:ind w:firstLine="709"/>
+        <w:jc w:val="both"/>
       </w:pPr>
       <w:r>
         <w:rPr>
@@ -2268,8 +2260,9 @@
     </w:p>
     <w:p>
       <w:pPr>
-        <w:pStyle w:val="ListBullet"/>
-        <w:spacing w:after="80" w:line="276" w:lineRule="auto"/>
+        <w:spacing w:before="0" w:after="160" w:line="276" w:lineRule="auto"/>
+        <w:ind w:firstLine="709"/>
+        <w:jc w:val="both"/>
       </w:pPr>
       <w:r>
         <w:rPr>
@@ -2283,8 +2276,9 @@
     </w:p>
     <w:p>
       <w:pPr>
-        <w:pStyle w:val="ListBullet"/>
-        <w:spacing w:after="80" w:line="276" w:lineRule="auto"/>
+        <w:spacing w:before="0" w:after="160" w:line="276" w:lineRule="auto"/>
+        <w:ind w:firstLine="709"/>
+        <w:jc w:val="both"/>
       </w:pPr>
       <w:r>
         <w:rPr>
@@ -2298,8 +2292,9 @@
     </w:p>
     <w:p>
       <w:pPr>
-        <w:pStyle w:val="ListBullet"/>
-        <w:spacing w:after="80" w:line="276" w:lineRule="auto"/>
+        <w:spacing w:before="0" w:after="160" w:line="276" w:lineRule="auto"/>
+        <w:ind w:firstLine="709"/>
+        <w:jc w:val="both"/>
       </w:pPr>
       <w:r>
         <w:rPr>
@@ -2313,8 +2308,9 @@
     </w:p>
     <w:p>
       <w:pPr>
-        <w:pStyle w:val="ListBullet"/>
-        <w:spacing w:after="80" w:line="276" w:lineRule="auto"/>
+        <w:spacing w:before="0" w:after="160" w:line="276" w:lineRule="auto"/>
+        <w:ind w:firstLine="709"/>
+        <w:jc w:val="both"/>
       </w:pPr>
       <w:r>
         <w:rPr>
@@ -2328,8 +2324,9 @@
     </w:p>
     <w:p>
       <w:pPr>
-        <w:pStyle w:val="ListBullet"/>
-        <w:spacing w:after="80" w:line="276" w:lineRule="auto"/>
+        <w:spacing w:before="0" w:after="160" w:line="276" w:lineRule="auto"/>
+        <w:ind w:firstLine="709"/>
+        <w:jc w:val="both"/>
       </w:pPr>
       <w:r>
         <w:rPr>
@@ -2343,8 +2340,9 @@
     </w:p>
     <w:p>
       <w:pPr>
-        <w:pStyle w:val="ListBullet"/>
-        <w:spacing w:after="80" w:line="276" w:lineRule="auto"/>
+        <w:spacing w:before="0" w:after="160" w:line="276" w:lineRule="auto"/>
+        <w:ind w:firstLine="709"/>
+        <w:jc w:val="both"/>
       </w:pPr>
       <w:r>
         <w:rPr>
@@ -2358,8 +2356,9 @@
     </w:p>
     <w:p>
       <w:pPr>
-        <w:pStyle w:val="ListBullet"/>
-        <w:spacing w:after="80" w:line="276" w:lineRule="auto"/>
+        <w:spacing w:before="0" w:after="160" w:line="276" w:lineRule="auto"/>
+        <w:ind w:firstLine="709"/>
+        <w:jc w:val="both"/>
       </w:pPr>
       <w:r>
         <w:rPr>
@@ -2373,7 +2372,7 @@
     </w:p>
     <w:p>
       <w:pPr>
-        <w:spacing w:before="480"/>
+        <w:spacing w:before="480" w:after="160" w:line="276" w:lineRule="auto"/>
         <w:jc w:val="center"/>
       </w:pPr>
       <w:r>
@@ -2381,7 +2380,7 @@
           <w:rFonts w:ascii="Times New Roman" w:hAnsi="Times New Roman" w:eastAsia="Times New Roman" w:cs="Times New Roman"/>
           <w:b w:val="0"/>
           <w:i/>
-          <w:color w:val="666666"/>
+          <w:color w:val="555555"/>
           <w:sz w:val="24"/>
         </w:rPr>
         <w:t>End of the retelling</w:t>

</xml_diff>